<commit_message>
Adding Swagger documentation. Updating Report.
</commit_message>
<xml_diff>
--- a/MLopsAutoencoder_Report.docx
+++ b/MLopsAutoencoder_Report.docx
@@ -122,6 +122,9 @@
     </w:p>
     <w:p>
       <w:r>
+        <w:rPr>
+          <w:noProof/>
+        </w:rPr>
         <w:lastRenderedPageBreak/>
         <w:drawing>
           <wp:inline distT="0" distB="0" distL="0" distR="0" wp14:anchorId="0B524EFD" wp14:editId="508E0382">
@@ -288,23 +291,7 @@
       </w:r>
       <w:r>
         <w:br/>
-        <w:t xml:space="preserve">- Output of </w:t>
-      </w:r>
-      <w:proofErr w:type="spellStart"/>
-      <w:r>
-        <w:t>kubectl</w:t>
-      </w:r>
-      <w:proofErr w:type="spellEnd"/>
-      <w:r>
-        <w:t xml:space="preserve"> get </w:t>
-      </w:r>
-      <w:proofErr w:type="spellStart"/>
-      <w:r>
-        <w:t>pods,svc,ingress</w:t>
-      </w:r>
-      <w:proofErr w:type="spellEnd"/>
-      <w:r>
-        <w:t>.</w:t>
+        <w:t>- Output of kubectl get pods,svc,ingress.</w:t>
       </w:r>
       <w:r>
         <w:rPr>
@@ -436,14 +423,12 @@
     </w:p>
     <w:p>
       <w:r>
-        <w:rPr>
-          <w:noProof/>
-        </w:rPr>
+        <w:lastRenderedPageBreak/>
         <w:drawing>
-          <wp:inline distT="0" distB="0" distL="0" distR="0" wp14:anchorId="63A95CF6" wp14:editId="14BD0C6F">
-            <wp:extent cx="5486400" cy="1893570"/>
+          <wp:inline distT="0" distB="0" distL="0" distR="0" wp14:anchorId="6E8CCB03" wp14:editId="3AD90481">
+            <wp:extent cx="5486400" cy="1889125"/>
             <wp:effectExtent l="0" t="0" r="0" b="0"/>
-            <wp:docPr id="310743658" name="Picture 1" descr="A screenshot of a computer&#10;&#10;AI-generated content may be incorrect."/>
+            <wp:docPr id="485111968" name="Picture 1" descr="A screenshot of a computer program&#10;&#10;AI-generated content may be incorrect."/>
             <wp:cNvGraphicFramePr>
               <a:graphicFrameLocks xmlns:a="http://schemas.openxmlformats.org/drawingml/2006/main" noChangeAspect="1"/>
             </wp:cNvGraphicFramePr>
@@ -451,7 +436,7 @@
               <a:graphicData uri="http://schemas.openxmlformats.org/drawingml/2006/picture">
                 <pic:pic xmlns:pic="http://schemas.openxmlformats.org/drawingml/2006/picture">
                   <pic:nvPicPr>
-                    <pic:cNvPr id="310743658" name="Picture 1" descr="A screenshot of a computer&#10;&#10;AI-generated content may be incorrect."/>
+                    <pic:cNvPr id="485111968" name="Picture 1" descr="A screenshot of a computer program&#10;&#10;AI-generated content may be incorrect."/>
                     <pic:cNvPicPr/>
                   </pic:nvPicPr>
                   <pic:blipFill>
@@ -463,7 +448,44 @@
                   <pic:spPr>
                     <a:xfrm>
                       <a:off x="0" y="0"/>
-                      <a:ext cx="5486400" cy="1893570"/>
+                      <a:ext cx="5486400" cy="1889125"/>
+                    </a:xfrm>
+                    <a:prstGeom prst="rect">
+                      <a:avLst/>
+                    </a:prstGeom>
+                  </pic:spPr>
+                </pic:pic>
+              </a:graphicData>
+            </a:graphic>
+          </wp:inline>
+        </w:drawing>
+      </w:r>
+      <w:r>
+        <w:drawing>
+          <wp:inline distT="0" distB="0" distL="0" distR="0" wp14:anchorId="60B1B478" wp14:editId="13BB0D7E">
+            <wp:extent cx="5486400" cy="5455285"/>
+            <wp:effectExtent l="0" t="0" r="0" b="0"/>
+            <wp:docPr id="1699755140" name="Picture 1" descr="A screenshot of a computer&#10;&#10;AI-generated content may be incorrect."/>
+            <wp:cNvGraphicFramePr>
+              <a:graphicFrameLocks xmlns:a="http://schemas.openxmlformats.org/drawingml/2006/main" noChangeAspect="1"/>
+            </wp:cNvGraphicFramePr>
+            <a:graphic xmlns:a="http://schemas.openxmlformats.org/drawingml/2006/main">
+              <a:graphicData uri="http://schemas.openxmlformats.org/drawingml/2006/picture">
+                <pic:pic xmlns:pic="http://schemas.openxmlformats.org/drawingml/2006/picture">
+                  <pic:nvPicPr>
+                    <pic:cNvPr id="1699755140" name="Picture 1" descr="A screenshot of a computer&#10;&#10;AI-generated content may be incorrect."/>
+                    <pic:cNvPicPr/>
+                  </pic:nvPicPr>
+                  <pic:blipFill>
+                    <a:blip r:embed="rId13"/>
+                    <a:stretch>
+                      <a:fillRect/>
+                    </a:stretch>
+                  </pic:blipFill>
+                  <pic:spPr>
+                    <a:xfrm>
+                      <a:off x="0" y="0"/>
+                      <a:ext cx="5486400" cy="5455285"/>
                     </a:xfrm>
                     <a:prstGeom prst="rect">
                       <a:avLst/>
@@ -514,18 +536,16 @@
         <w:t>- GitHub Actions workflow runs (showing retrain, build, deploy steps).</w:t>
       </w:r>
     </w:p>
-    <w:p/>
     <w:p>
       <w:r>
         <w:rPr>
           <w:noProof/>
         </w:rPr>
-        <w:lastRenderedPageBreak/>
         <w:drawing>
-          <wp:inline distT="0" distB="0" distL="0" distR="0" wp14:anchorId="5E9CD7F2" wp14:editId="6D026FBB">
-            <wp:extent cx="5486400" cy="5651500"/>
-            <wp:effectExtent l="0" t="0" r="0" b="6350"/>
-            <wp:docPr id="196205952" name="Picture 1" descr="A screenshot of a computer&#10;&#10;AI-generated content may be incorrect."/>
+          <wp:inline distT="0" distB="0" distL="0" distR="0" wp14:anchorId="3437010B" wp14:editId="736EB2E6">
+            <wp:extent cx="5486400" cy="3515360"/>
+            <wp:effectExtent l="0" t="0" r="0" b="8890"/>
+            <wp:docPr id="1214657469" name="Picture 1" descr="A screenshot of a computer&#10;&#10;AI-generated content may be incorrect."/>
             <wp:cNvGraphicFramePr>
               <a:graphicFrameLocks xmlns:a="http://schemas.openxmlformats.org/drawingml/2006/main" noChangeAspect="1"/>
             </wp:cNvGraphicFramePr>
@@ -533,11 +553,11 @@
               <a:graphicData uri="http://schemas.openxmlformats.org/drawingml/2006/picture">
                 <pic:pic xmlns:pic="http://schemas.openxmlformats.org/drawingml/2006/picture">
                   <pic:nvPicPr>
-                    <pic:cNvPr id="196205952" name="Picture 1" descr="A screenshot of a computer&#10;&#10;AI-generated content may be incorrect."/>
+                    <pic:cNvPr id="1214657469" name="Picture 1" descr="A screenshot of a computer&#10;&#10;AI-generated content may be incorrect."/>
                     <pic:cNvPicPr/>
                   </pic:nvPicPr>
                   <pic:blipFill>
-                    <a:blip r:embed="rId13"/>
+                    <a:blip r:embed="rId14"/>
                     <a:stretch>
                       <a:fillRect/>
                     </a:stretch>
@@ -545,7 +565,7 @@
                   <pic:spPr>
                     <a:xfrm>
                       <a:off x="0" y="0"/>
-                      <a:ext cx="5486400" cy="5651500"/>
+                      <a:ext cx="5486400" cy="3515360"/>
                     </a:xfrm>
                     <a:prstGeom prst="rect">
                       <a:avLst/>
@@ -557,10 +577,15 @@
           </wp:inline>
         </w:drawing>
       </w:r>
+    </w:p>
+    <w:p>
       <w:r>
+        <w:rPr>
+          <w:noProof/>
+        </w:rPr>
         <w:lastRenderedPageBreak/>
         <w:drawing>
-          <wp:inline distT="0" distB="0" distL="0" distR="0" wp14:anchorId="52BC126F" wp14:editId="58089AB5">
+          <wp:inline distT="0" distB="0" distL="0" distR="0" wp14:anchorId="52BC126F" wp14:editId="44FB5136">
             <wp:extent cx="5486400" cy="4606925"/>
             <wp:effectExtent l="0" t="0" r="0" b="3175"/>
             <wp:docPr id="332377635" name="Picture 1" descr="A screenshot of a computer&#10;&#10;AI-generated content may be incorrect."/>
@@ -575,7 +600,7 @@
                     <pic:cNvPicPr/>
                   </pic:nvPicPr>
                   <pic:blipFill>
-                    <a:blip r:embed="rId14"/>
+                    <a:blip r:embed="rId15"/>
                     <a:stretch>
                       <a:fillRect/>
                     </a:stretch>
@@ -584,6 +609,127 @@
                     <a:xfrm>
                       <a:off x="0" y="0"/>
                       <a:ext cx="5486400" cy="4606925"/>
+                    </a:xfrm>
+                    <a:prstGeom prst="rect">
+                      <a:avLst/>
+                    </a:prstGeom>
+                  </pic:spPr>
+                </pic:pic>
+              </a:graphicData>
+            </a:graphic>
+          </wp:inline>
+        </w:drawing>
+      </w:r>
+    </w:p>
+    <w:p>
+      <w:r>
+        <w:lastRenderedPageBreak/>
+        <w:drawing>
+          <wp:inline distT="0" distB="0" distL="0" distR="0" wp14:anchorId="49C97BE2" wp14:editId="4CC3D891">
+            <wp:extent cx="5486400" cy="3863975"/>
+            <wp:effectExtent l="0" t="0" r="0" b="3175"/>
+            <wp:docPr id="1248752226" name="Picture 1" descr="A screenshot of a computer&#10;&#10;AI-generated content may be incorrect."/>
+            <wp:cNvGraphicFramePr>
+              <a:graphicFrameLocks xmlns:a="http://schemas.openxmlformats.org/drawingml/2006/main" noChangeAspect="1"/>
+            </wp:cNvGraphicFramePr>
+            <a:graphic xmlns:a="http://schemas.openxmlformats.org/drawingml/2006/main">
+              <a:graphicData uri="http://schemas.openxmlformats.org/drawingml/2006/picture">
+                <pic:pic xmlns:pic="http://schemas.openxmlformats.org/drawingml/2006/picture">
+                  <pic:nvPicPr>
+                    <pic:cNvPr id="1248752226" name="Picture 1" descr="A screenshot of a computer&#10;&#10;AI-generated content may be incorrect."/>
+                    <pic:cNvPicPr/>
+                  </pic:nvPicPr>
+                  <pic:blipFill>
+                    <a:blip r:embed="rId16"/>
+                    <a:stretch>
+                      <a:fillRect/>
+                    </a:stretch>
+                  </pic:blipFill>
+                  <pic:spPr>
+                    <a:xfrm>
+                      <a:off x="0" y="0"/>
+                      <a:ext cx="5486400" cy="3863975"/>
+                    </a:xfrm>
+                    <a:prstGeom prst="rect">
+                      <a:avLst/>
+                    </a:prstGeom>
+                  </pic:spPr>
+                </pic:pic>
+              </a:graphicData>
+            </a:graphic>
+          </wp:inline>
+        </w:drawing>
+      </w:r>
+      <w:r>
+        <w:rPr>
+          <w:noProof/>
+        </w:rPr>
+        <w:drawing>
+          <wp:inline distT="0" distB="0" distL="0" distR="0" wp14:anchorId="651DF0B1" wp14:editId="468DCD70">
+            <wp:extent cx="5486400" cy="3648710"/>
+            <wp:effectExtent l="0" t="0" r="0" b="8890"/>
+            <wp:docPr id="834237705" name="Picture 1" descr="A screenshot of a computer&#10;&#10;AI-generated content may be incorrect."/>
+            <wp:cNvGraphicFramePr>
+              <a:graphicFrameLocks xmlns:a="http://schemas.openxmlformats.org/drawingml/2006/main" noChangeAspect="1"/>
+            </wp:cNvGraphicFramePr>
+            <a:graphic xmlns:a="http://schemas.openxmlformats.org/drawingml/2006/main">
+              <a:graphicData uri="http://schemas.openxmlformats.org/drawingml/2006/picture">
+                <pic:pic xmlns:pic="http://schemas.openxmlformats.org/drawingml/2006/picture">
+                  <pic:nvPicPr>
+                    <pic:cNvPr id="834237705" name="Picture 1" descr="A screenshot of a computer&#10;&#10;AI-generated content may be incorrect."/>
+                    <pic:cNvPicPr/>
+                  </pic:nvPicPr>
+                  <pic:blipFill>
+                    <a:blip r:embed="rId17"/>
+                    <a:stretch>
+                      <a:fillRect/>
+                    </a:stretch>
+                  </pic:blipFill>
+                  <pic:spPr>
+                    <a:xfrm>
+                      <a:off x="0" y="0"/>
+                      <a:ext cx="5486400" cy="3648710"/>
+                    </a:xfrm>
+                    <a:prstGeom prst="rect">
+                      <a:avLst/>
+                    </a:prstGeom>
+                  </pic:spPr>
+                </pic:pic>
+              </a:graphicData>
+            </a:graphic>
+          </wp:inline>
+        </w:drawing>
+      </w:r>
+      <w:r>
+        <w:rPr>
+          <w:noProof/>
+        </w:rPr>
+        <w:lastRenderedPageBreak/>
+        <w:drawing>
+          <wp:inline distT="0" distB="0" distL="0" distR="0" wp14:anchorId="14CC1CE1" wp14:editId="48D6DC20">
+            <wp:extent cx="5486400" cy="3562985"/>
+            <wp:effectExtent l="0" t="0" r="0" b="0"/>
+            <wp:docPr id="1511169831" name="Picture 1" descr="A screenshot of a computer&#10;&#10;AI-generated content may be incorrect."/>
+            <wp:cNvGraphicFramePr>
+              <a:graphicFrameLocks xmlns:a="http://schemas.openxmlformats.org/drawingml/2006/main" noChangeAspect="1"/>
+            </wp:cNvGraphicFramePr>
+            <a:graphic xmlns:a="http://schemas.openxmlformats.org/drawingml/2006/main">
+              <a:graphicData uri="http://schemas.openxmlformats.org/drawingml/2006/picture">
+                <pic:pic xmlns:pic="http://schemas.openxmlformats.org/drawingml/2006/picture">
+                  <pic:nvPicPr>
+                    <pic:cNvPr id="1511169831" name="Picture 1" descr="A screenshot of a computer&#10;&#10;AI-generated content may be incorrect."/>
+                    <pic:cNvPicPr/>
+                  </pic:nvPicPr>
+                  <pic:blipFill>
+                    <a:blip r:embed="rId18"/>
+                    <a:stretch>
+                      <a:fillRect/>
+                    </a:stretch>
+                  </pic:blipFill>
+                  <pic:spPr>
+                    <a:xfrm>
+                      <a:off x="0" y="0"/>
+                      <a:ext cx="5486400" cy="3562985"/>
                     </a:xfrm>
                     <a:prstGeom prst="rect">
                       <a:avLst/>
@@ -631,15 +777,7 @@
       </w:r>
       <w:r>
         <w:br/>
-        <w:t xml:space="preserve">- The running Kubernetes cluster (kubectl get </w:t>
-      </w:r>
-      <w:proofErr w:type="gramStart"/>
-      <w:r>
-        <w:t>pods,svc</w:t>
-      </w:r>
-      <w:proofErr w:type="gramEnd"/>
-      <w:r>
-        <w:t>,ingress).</w:t>
+        <w:t>- The running Kubernetes cluster (kubectl get pods,svc,ingress).</w:t>
       </w:r>
     </w:p>
     <w:p>
@@ -647,7 +785,6 @@
         <w:pStyle w:val="Heading1"/>
       </w:pPr>
       <w:r>
-        <w:lastRenderedPageBreak/>
         <w:t>Additional Notes</w:t>
       </w:r>
     </w:p>
@@ -666,6 +803,7 @@
     </w:p>
     <w:p>
       <w:r>
+        <w:lastRenderedPageBreak/>
         <w:br/>
         <w:t>Author:</w:t>
       </w:r>

</xml_diff>

<commit_message>
improving workflow, script.js, adding /docs to ingress.
</commit_message>
<xml_diff>
--- a/MLopsAutoencoder_Report.docx
+++ b/MLopsAutoencoder_Report.docx
@@ -497,13 +497,50 @@
           </wp:inline>
         </w:drawing>
       </w:r>
+      <w:r>
+        <w:lastRenderedPageBreak/>
+        <w:drawing>
+          <wp:inline distT="0" distB="0" distL="0" distR="0" wp14:anchorId="6758B556" wp14:editId="690EBF5A">
+            <wp:extent cx="5486400" cy="3564890"/>
+            <wp:effectExtent l="0" t="0" r="0" b="0"/>
+            <wp:docPr id="489583067" name="Picture 1" descr="A screenshot of a computer&#10;&#10;AI-generated content may be incorrect."/>
+            <wp:cNvGraphicFramePr>
+              <a:graphicFrameLocks xmlns:a="http://schemas.openxmlformats.org/drawingml/2006/main" noChangeAspect="1"/>
+            </wp:cNvGraphicFramePr>
+            <a:graphic xmlns:a="http://schemas.openxmlformats.org/drawingml/2006/main">
+              <a:graphicData uri="http://schemas.openxmlformats.org/drawingml/2006/picture">
+                <pic:pic xmlns:pic="http://schemas.openxmlformats.org/drawingml/2006/picture">
+                  <pic:nvPicPr>
+                    <pic:cNvPr id="489583067" name="Picture 1" descr="A screenshot of a computer&#10;&#10;AI-generated content may be incorrect."/>
+                    <pic:cNvPicPr/>
+                  </pic:nvPicPr>
+                  <pic:blipFill>
+                    <a:blip r:embed="rId14"/>
+                    <a:stretch>
+                      <a:fillRect/>
+                    </a:stretch>
+                  </pic:blipFill>
+                  <pic:spPr>
+                    <a:xfrm>
+                      <a:off x="0" y="0"/>
+                      <a:ext cx="5486400" cy="3564890"/>
+                    </a:xfrm>
+                    <a:prstGeom prst="rect">
+                      <a:avLst/>
+                    </a:prstGeom>
+                  </pic:spPr>
+                </pic:pic>
+              </a:graphicData>
+            </a:graphic>
+          </wp:inline>
+        </w:drawing>
+      </w:r>
     </w:p>
     <w:p>
       <w:pPr>
         <w:pStyle w:val="Heading1"/>
       </w:pPr>
       <w:r>
-        <w:lastRenderedPageBreak/>
         <w:t>Task 3: CI/CD Automation (GitHub Actions)</w:t>
       </w:r>
     </w:p>
@@ -541,6 +578,7 @@
         <w:rPr>
           <w:noProof/>
         </w:rPr>
+        <w:lastRenderedPageBreak/>
         <w:drawing>
           <wp:inline distT="0" distB="0" distL="0" distR="0" wp14:anchorId="3437010B" wp14:editId="736EB2E6">
             <wp:extent cx="5486400" cy="3515360"/>
@@ -557,7 +595,7 @@
                     <pic:cNvPicPr/>
                   </pic:nvPicPr>
                   <pic:blipFill>
-                    <a:blip r:embed="rId14"/>
+                    <a:blip r:embed="rId15"/>
                     <a:stretch>
                       <a:fillRect/>
                     </a:stretch>
@@ -600,7 +638,7 @@
                     <pic:cNvPicPr/>
                   </pic:nvPicPr>
                   <pic:blipFill>
-                    <a:blip r:embed="rId15"/>
+                    <a:blip r:embed="rId16"/>
                     <a:stretch>
                       <a:fillRect/>
                     </a:stretch>
@@ -640,7 +678,7 @@
                     <pic:cNvPicPr/>
                   </pic:nvPicPr>
                   <pic:blipFill>
-                    <a:blip r:embed="rId16"/>
+                    <a:blip r:embed="rId17"/>
                     <a:stretch>
                       <a:fillRect/>
                     </a:stretch>
@@ -680,7 +718,7 @@
                     <pic:cNvPicPr/>
                   </pic:nvPicPr>
                   <pic:blipFill>
-                    <a:blip r:embed="rId17"/>
+                    <a:blip r:embed="rId18"/>
                     <a:stretch>
                       <a:fillRect/>
                     </a:stretch>
@@ -721,7 +759,7 @@
                     <pic:cNvPicPr/>
                   </pic:nvPicPr>
                   <pic:blipFill>
-                    <a:blip r:embed="rId18"/>
+                    <a:blip r:embed="rId19"/>
                     <a:stretch>
                       <a:fillRect/>
                     </a:stretch>

</xml_diff>

<commit_message>
Updating workflow. Updating report.
</commit_message>
<xml_diff>
--- a/MLopsAutoencoder_Report.docx
+++ b/MLopsAutoencoder_Report.docx
@@ -20,12 +20,38 @@
     </w:p>
     <w:p>
       <w:r>
-        <w:t>• MLopsAutoencoder GitHub Repository: https://github.com/LovepreetSinghGhuman/MLopsAutoencoder.git</w:t>
+        <w:t xml:space="preserve">• MLopsAutoencoder GitHub Repository: </w:t>
+      </w:r>
+      <w:hyperlink r:id="rId6" w:history="1">
+        <w:r>
+          <w:rPr>
+            <w:rStyle w:val="Hyperlink"/>
+          </w:rPr>
+          <w:t>https://github.com/LovepreetSinghGhuman/MLopsAutoencoder.git</w:t>
+        </w:r>
+      </w:hyperlink>
+      <w:r>
+        <w:br/>
+      </w:r>
+      <w:r>
+        <w:t xml:space="preserve">• MLopsAutoencoder GitHub </w:t>
+      </w:r>
+      <w:r>
+        <w:t>Branch</w:t>
+      </w:r>
+      <w:r>
+        <w:t>:</w:t>
+      </w:r>
+      <w:r>
+        <w:t xml:space="preserve"> azurePipelines</w:t>
       </w:r>
     </w:p>
     <w:p>
       <w:r>
         <w:t xml:space="preserve">• Demo Video: </w:t>
+      </w:r>
+      <w:r>
+        <w:t>https://howest.cloud.panopto.eu/Panopto/Pages/Viewer.aspx?id=48a44fef-cda8-4b33-8a8c-b33001858a1f</w:t>
       </w:r>
     </w:p>
     <w:p>
@@ -113,6 +139,9 @@
       </w:r>
       <w:r>
         <w:br/>
+      </w:r>
+      <w:r>
+        <w:lastRenderedPageBreak/>
         <w:t>- Azure ML job submission and completion (portal or CLI).</w:t>
       </w:r>
       <w:r>
@@ -142,7 +171,7 @@
                     <pic:cNvPicPr/>
                   </pic:nvPicPr>
                   <pic:blipFill>
-                    <a:blip r:embed="rId6"/>
+                    <a:blip r:embed="rId7"/>
                     <a:stretch>
                       <a:fillRect/>
                     </a:stretch>
@@ -183,7 +212,7 @@
                     <pic:cNvPicPr/>
                   </pic:nvPicPr>
                   <pic:blipFill>
-                    <a:blip r:embed="rId7"/>
+                    <a:blip r:embed="rId8"/>
                     <a:stretch>
                       <a:fillRect/>
                     </a:stretch>
@@ -224,7 +253,7 @@
                     <pic:cNvPicPr/>
                   </pic:nvPicPr>
                   <pic:blipFill>
-                    <a:blip r:embed="rId8"/>
+                    <a:blip r:embed="rId9"/>
                     <a:stretch>
                       <a:fillRect/>
                     </a:stretch>
@@ -233,6 +262,47 @@
                     <a:xfrm>
                       <a:off x="0" y="0"/>
                       <a:ext cx="5486400" cy="4815205"/>
+                    </a:xfrm>
+                    <a:prstGeom prst="rect">
+                      <a:avLst/>
+                    </a:prstGeom>
+                  </pic:spPr>
+                </pic:pic>
+              </a:graphicData>
+            </a:graphic>
+          </wp:inline>
+        </w:drawing>
+      </w:r>
+      <w:r>
+        <w:rPr>
+          <w:noProof/>
+        </w:rPr>
+        <w:lastRenderedPageBreak/>
+        <w:drawing>
+          <wp:inline distT="0" distB="0" distL="0" distR="0" wp14:anchorId="6E7CC374" wp14:editId="4D50838B">
+            <wp:extent cx="5486400" cy="4306570"/>
+            <wp:effectExtent l="0" t="0" r="0" b="0"/>
+            <wp:docPr id="1129265317" name="Picture 1" descr="A screenshot of a computer&#10;&#10;AI-generated content may be incorrect."/>
+            <wp:cNvGraphicFramePr>
+              <a:graphicFrameLocks xmlns:a="http://schemas.openxmlformats.org/drawingml/2006/main" noChangeAspect="1"/>
+            </wp:cNvGraphicFramePr>
+            <a:graphic xmlns:a="http://schemas.openxmlformats.org/drawingml/2006/main">
+              <a:graphicData uri="http://schemas.openxmlformats.org/drawingml/2006/picture">
+                <pic:pic xmlns:pic="http://schemas.openxmlformats.org/drawingml/2006/picture">
+                  <pic:nvPicPr>
+                    <pic:cNvPr id="1129265317" name="Picture 1" descr="A screenshot of a computer&#10;&#10;AI-generated content may be incorrect."/>
+                    <pic:cNvPicPr/>
+                  </pic:nvPicPr>
+                  <pic:blipFill>
+                    <a:blip r:embed="rId10"/>
+                    <a:stretch>
+                      <a:fillRect/>
+                    </a:stretch>
+                  </pic:blipFill>
+                  <pic:spPr>
+                    <a:xfrm>
+                      <a:off x="0" y="0"/>
+                      <a:ext cx="5486400" cy="4306570"/>
                     </a:xfrm>
                     <a:prstGeom prst="rect">
                       <a:avLst/>
@@ -320,7 +390,7 @@
                     <pic:cNvPicPr/>
                   </pic:nvPicPr>
                   <pic:blipFill>
-                    <a:blip r:embed="rId9"/>
+                    <a:blip r:embed="rId11"/>
                     <a:stretch>
                       <a:fillRect/>
                     </a:stretch>
@@ -360,7 +430,7 @@
                     <pic:cNvPicPr/>
                   </pic:nvPicPr>
                   <pic:blipFill>
-                    <a:blip r:embed="rId10"/>
+                    <a:blip r:embed="rId12"/>
                     <a:stretch>
                       <a:fillRect/>
                     </a:stretch>
@@ -400,7 +470,7 @@
                     <pic:cNvPicPr/>
                   </pic:nvPicPr>
                   <pic:blipFill>
-                    <a:blip r:embed="rId11"/>
+                    <a:blip r:embed="rId13"/>
                     <a:stretch>
                       <a:fillRect/>
                     </a:stretch>
@@ -423,6 +493,9 @@
     </w:p>
     <w:p>
       <w:r>
+        <w:rPr>
+          <w:noProof/>
+        </w:rPr>
         <w:lastRenderedPageBreak/>
         <w:drawing>
           <wp:inline distT="0" distB="0" distL="0" distR="0" wp14:anchorId="6E8CCB03" wp14:editId="3AD90481">
@@ -440,7 +513,7 @@
                     <pic:cNvPicPr/>
                   </pic:nvPicPr>
                   <pic:blipFill>
-                    <a:blip r:embed="rId12"/>
+                    <a:blip r:embed="rId14"/>
                     <a:stretch>
                       <a:fillRect/>
                     </a:stretch>
@@ -461,6 +534,9 @@
         </w:drawing>
       </w:r>
       <w:r>
+        <w:rPr>
+          <w:noProof/>
+        </w:rPr>
         <w:drawing>
           <wp:inline distT="0" distB="0" distL="0" distR="0" wp14:anchorId="60B1B478" wp14:editId="13BB0D7E">
             <wp:extent cx="5486400" cy="5455285"/>
@@ -477,7 +553,7 @@
                     <pic:cNvPicPr/>
                   </pic:nvPicPr>
                   <pic:blipFill>
-                    <a:blip r:embed="rId13"/>
+                    <a:blip r:embed="rId15"/>
                     <a:stretch>
                       <a:fillRect/>
                     </a:stretch>
@@ -498,6 +574,9 @@
         </w:drawing>
       </w:r>
       <w:r>
+        <w:rPr>
+          <w:noProof/>
+        </w:rPr>
         <w:lastRenderedPageBreak/>
         <w:drawing>
           <wp:inline distT="0" distB="0" distL="0" distR="0" wp14:anchorId="6758B556" wp14:editId="690EBF5A">
@@ -515,7 +594,7 @@
                     <pic:cNvPicPr/>
                   </pic:nvPicPr>
                   <pic:blipFill>
-                    <a:blip r:embed="rId14"/>
+                    <a:blip r:embed="rId16"/>
                     <a:stretch>
                       <a:fillRect/>
                     </a:stretch>
@@ -573,49 +652,7 @@
         <w:t>- GitHub Actions workflow runs (showing retrain, build, deploy steps).</w:t>
       </w:r>
     </w:p>
-    <w:p>
-      <w:r>
-        <w:rPr>
-          <w:noProof/>
-        </w:rPr>
-        <w:lastRenderedPageBreak/>
-        <w:drawing>
-          <wp:inline distT="0" distB="0" distL="0" distR="0" wp14:anchorId="3437010B" wp14:editId="736EB2E6">
-            <wp:extent cx="5486400" cy="3515360"/>
-            <wp:effectExtent l="0" t="0" r="0" b="8890"/>
-            <wp:docPr id="1214657469" name="Picture 1" descr="A screenshot of a computer&#10;&#10;AI-generated content may be incorrect."/>
-            <wp:cNvGraphicFramePr>
-              <a:graphicFrameLocks xmlns:a="http://schemas.openxmlformats.org/drawingml/2006/main" noChangeAspect="1"/>
-            </wp:cNvGraphicFramePr>
-            <a:graphic xmlns:a="http://schemas.openxmlformats.org/drawingml/2006/main">
-              <a:graphicData uri="http://schemas.openxmlformats.org/drawingml/2006/picture">
-                <pic:pic xmlns:pic="http://schemas.openxmlformats.org/drawingml/2006/picture">
-                  <pic:nvPicPr>
-                    <pic:cNvPr id="1214657469" name="Picture 1" descr="A screenshot of a computer&#10;&#10;AI-generated content may be incorrect."/>
-                    <pic:cNvPicPr/>
-                  </pic:nvPicPr>
-                  <pic:blipFill>
-                    <a:blip r:embed="rId15"/>
-                    <a:stretch>
-                      <a:fillRect/>
-                    </a:stretch>
-                  </pic:blipFill>
-                  <pic:spPr>
-                    <a:xfrm>
-                      <a:off x="0" y="0"/>
-                      <a:ext cx="5486400" cy="3515360"/>
-                    </a:xfrm>
-                    <a:prstGeom prst="rect">
-                      <a:avLst/>
-                    </a:prstGeom>
-                  </pic:spPr>
-                </pic:pic>
-              </a:graphicData>
-            </a:graphic>
-          </wp:inline>
-        </w:drawing>
-      </w:r>
-    </w:p>
+    <w:p/>
     <w:p>
       <w:r>
         <w:rPr>
@@ -638,7 +675,7 @@
                     <pic:cNvPicPr/>
                   </pic:nvPicPr>
                   <pic:blipFill>
-                    <a:blip r:embed="rId16"/>
+                    <a:blip r:embed="rId17"/>
                     <a:stretch>
                       <a:fillRect/>
                     </a:stretch>
@@ -661,12 +698,15 @@
     </w:p>
     <w:p>
       <w:r>
+        <w:rPr>
+          <w:noProof/>
+        </w:rPr>
         <w:lastRenderedPageBreak/>
         <w:drawing>
-          <wp:inline distT="0" distB="0" distL="0" distR="0" wp14:anchorId="49C97BE2" wp14:editId="4CC3D891">
-            <wp:extent cx="5486400" cy="3863975"/>
-            <wp:effectExtent l="0" t="0" r="0" b="3175"/>
-            <wp:docPr id="1248752226" name="Picture 1" descr="A screenshot of a computer&#10;&#10;AI-generated content may be incorrect."/>
+          <wp:inline distT="0" distB="0" distL="0" distR="0" wp14:anchorId="004D478E" wp14:editId="1E5C9747">
+            <wp:extent cx="5486400" cy="3542665"/>
+            <wp:effectExtent l="0" t="0" r="0" b="635"/>
+            <wp:docPr id="1942987508" name="Picture 1" descr="A screenshot of a computer&#10;&#10;AI-generated content may be incorrect."/>
             <wp:cNvGraphicFramePr>
               <a:graphicFrameLocks xmlns:a="http://schemas.openxmlformats.org/drawingml/2006/main" noChangeAspect="1"/>
             </wp:cNvGraphicFramePr>
@@ -674,11 +714,11 @@
               <a:graphicData uri="http://schemas.openxmlformats.org/drawingml/2006/picture">
                 <pic:pic xmlns:pic="http://schemas.openxmlformats.org/drawingml/2006/picture">
                   <pic:nvPicPr>
-                    <pic:cNvPr id="1248752226" name="Picture 1" descr="A screenshot of a computer&#10;&#10;AI-generated content may be incorrect."/>
+                    <pic:cNvPr id="1942987508" name="Picture 1" descr="A screenshot of a computer&#10;&#10;AI-generated content may be incorrect."/>
                     <pic:cNvPicPr/>
                   </pic:nvPicPr>
                   <pic:blipFill>
-                    <a:blip r:embed="rId17"/>
+                    <a:blip r:embed="rId18"/>
                     <a:stretch>
                       <a:fillRect/>
                     </a:stretch>
@@ -686,7 +726,7 @@
                   <pic:spPr>
                     <a:xfrm>
                       <a:off x="0" y="0"/>
-                      <a:ext cx="5486400" cy="3863975"/>
+                      <a:ext cx="5486400" cy="3542665"/>
                     </a:xfrm>
                     <a:prstGeom prst="rect">
                       <a:avLst/>
@@ -703,10 +743,10 @@
           <w:noProof/>
         </w:rPr>
         <w:drawing>
-          <wp:inline distT="0" distB="0" distL="0" distR="0" wp14:anchorId="651DF0B1" wp14:editId="468DCD70">
-            <wp:extent cx="5486400" cy="3648710"/>
-            <wp:effectExtent l="0" t="0" r="0" b="8890"/>
-            <wp:docPr id="834237705" name="Picture 1" descr="A screenshot of a computer&#10;&#10;AI-generated content may be incorrect."/>
+          <wp:inline distT="0" distB="0" distL="0" distR="0" wp14:anchorId="03B59BEA" wp14:editId="42E4C818">
+            <wp:extent cx="5486400" cy="4073525"/>
+            <wp:effectExtent l="0" t="0" r="0" b="3175"/>
+            <wp:docPr id="508713537" name="Picture 1" descr="A screenshot of a computer&#10;&#10;AI-generated content may be incorrect."/>
             <wp:cNvGraphicFramePr>
               <a:graphicFrameLocks xmlns:a="http://schemas.openxmlformats.org/drawingml/2006/main" noChangeAspect="1"/>
             </wp:cNvGraphicFramePr>
@@ -714,11 +754,11 @@
               <a:graphicData uri="http://schemas.openxmlformats.org/drawingml/2006/picture">
                 <pic:pic xmlns:pic="http://schemas.openxmlformats.org/drawingml/2006/picture">
                   <pic:nvPicPr>
-                    <pic:cNvPr id="834237705" name="Picture 1" descr="A screenshot of a computer&#10;&#10;AI-generated content may be incorrect."/>
+                    <pic:cNvPr id="508713537" name="Picture 1" descr="A screenshot of a computer&#10;&#10;AI-generated content may be incorrect."/>
                     <pic:cNvPicPr/>
                   </pic:nvPicPr>
                   <pic:blipFill>
-                    <a:blip r:embed="rId18"/>
+                    <a:blip r:embed="rId19"/>
                     <a:stretch>
                       <a:fillRect/>
                     </a:stretch>
@@ -726,7 +766,7 @@
                   <pic:spPr>
                     <a:xfrm>
                       <a:off x="0" y="0"/>
-                      <a:ext cx="5486400" cy="3648710"/>
+                      <a:ext cx="5486400" cy="4073525"/>
                     </a:xfrm>
                     <a:prstGeom prst="rect">
                       <a:avLst/>
@@ -744,10 +784,10 @@
         </w:rPr>
         <w:lastRenderedPageBreak/>
         <w:drawing>
-          <wp:inline distT="0" distB="0" distL="0" distR="0" wp14:anchorId="14CC1CE1" wp14:editId="48D6DC20">
-            <wp:extent cx="5486400" cy="3562985"/>
-            <wp:effectExtent l="0" t="0" r="0" b="0"/>
-            <wp:docPr id="1511169831" name="Picture 1" descr="A screenshot of a computer&#10;&#10;AI-generated content may be incorrect."/>
+          <wp:inline distT="0" distB="0" distL="0" distR="0" wp14:anchorId="7E6A2E01" wp14:editId="36749C20">
+            <wp:extent cx="5486400" cy="3839845"/>
+            <wp:effectExtent l="0" t="0" r="0" b="8255"/>
+            <wp:docPr id="1915708766" name="Picture 1" descr="A screenshot of a computer&#10;&#10;AI-generated content may be incorrect."/>
             <wp:cNvGraphicFramePr>
               <a:graphicFrameLocks xmlns:a="http://schemas.openxmlformats.org/drawingml/2006/main" noChangeAspect="1"/>
             </wp:cNvGraphicFramePr>
@@ -755,11 +795,11 @@
               <a:graphicData uri="http://schemas.openxmlformats.org/drawingml/2006/picture">
                 <pic:pic xmlns:pic="http://schemas.openxmlformats.org/drawingml/2006/picture">
                   <pic:nvPicPr>
-                    <pic:cNvPr id="1511169831" name="Picture 1" descr="A screenshot of a computer&#10;&#10;AI-generated content may be incorrect."/>
+                    <pic:cNvPr id="1915708766" name="Picture 1" descr="A screenshot of a computer&#10;&#10;AI-generated content may be incorrect."/>
                     <pic:cNvPicPr/>
                   </pic:nvPicPr>
                   <pic:blipFill>
-                    <a:blip r:embed="rId19"/>
+                    <a:blip r:embed="rId20"/>
                     <a:stretch>
                       <a:fillRect/>
                     </a:stretch>
@@ -767,7 +807,48 @@
                   <pic:spPr>
                     <a:xfrm>
                       <a:off x="0" y="0"/>
-                      <a:ext cx="5486400" cy="3562985"/>
+                      <a:ext cx="5486400" cy="3839845"/>
+                    </a:xfrm>
+                    <a:prstGeom prst="rect">
+                      <a:avLst/>
+                    </a:prstGeom>
+                  </pic:spPr>
+                </pic:pic>
+              </a:graphicData>
+            </a:graphic>
+          </wp:inline>
+        </w:drawing>
+      </w:r>
+      <w:r>
+        <w:rPr>
+          <w:noProof/>
+        </w:rPr>
+        <w:lastRenderedPageBreak/>
+        <w:drawing>
+          <wp:inline distT="0" distB="0" distL="0" distR="0" wp14:anchorId="164180AE" wp14:editId="03D293F8">
+            <wp:extent cx="5486400" cy="4954270"/>
+            <wp:effectExtent l="0" t="0" r="0" b="0"/>
+            <wp:docPr id="1725752518" name="Picture 1" descr="A screenshot of a computer&#10;&#10;AI-generated content may be incorrect."/>
+            <wp:cNvGraphicFramePr>
+              <a:graphicFrameLocks xmlns:a="http://schemas.openxmlformats.org/drawingml/2006/main" noChangeAspect="1"/>
+            </wp:cNvGraphicFramePr>
+            <a:graphic xmlns:a="http://schemas.openxmlformats.org/drawingml/2006/main">
+              <a:graphicData uri="http://schemas.openxmlformats.org/drawingml/2006/picture">
+                <pic:pic xmlns:pic="http://schemas.openxmlformats.org/drawingml/2006/picture">
+                  <pic:nvPicPr>
+                    <pic:cNvPr id="1725752518" name="Picture 1" descr="A screenshot of a computer&#10;&#10;AI-generated content may be incorrect."/>
+                    <pic:cNvPicPr/>
+                  </pic:nvPicPr>
+                  <pic:blipFill>
+                    <a:blip r:embed="rId21"/>
+                    <a:stretch>
+                      <a:fillRect/>
+                    </a:stretch>
+                  </pic:blipFill>
+                  <pic:spPr>
+                    <a:xfrm>
+                      <a:off x="0" y="0"/>
+                      <a:ext cx="5486400" cy="4954270"/>
                     </a:xfrm>
                     <a:prstGeom prst="rect">
                       <a:avLst/>
@@ -823,6 +904,7 @@
         <w:pStyle w:val="Heading1"/>
       </w:pPr>
       <w:r>
+        <w:lastRenderedPageBreak/>
         <w:t>Additional Notes</w:t>
       </w:r>
     </w:p>
@@ -841,7 +923,6 @@
     </w:p>
     <w:p>
       <w:r>
-        <w:lastRenderedPageBreak/>
         <w:br/>
         <w:t>Author:</w:t>
       </w:r>
@@ -12447,6 +12528,29 @@
       </w:tcPr>
     </w:tblStylePr>
   </w:style>
+  <w:style w:type="character" w:styleId="Hyperlink">
+    <w:name w:val="Hyperlink"/>
+    <w:basedOn w:val="DefaultParagraphFont"/>
+    <w:uiPriority w:val="99"/>
+    <w:unhideWhenUsed/>
+    <w:rsid w:val="00C73146"/>
+    <w:rPr>
+      <w:color w:val="0000FF" w:themeColor="hyperlink"/>
+      <w:u w:val="single"/>
+    </w:rPr>
+  </w:style>
+  <w:style w:type="character" w:styleId="UnresolvedMention">
+    <w:name w:val="Unresolved Mention"/>
+    <w:basedOn w:val="DefaultParagraphFont"/>
+    <w:uiPriority w:val="99"/>
+    <w:semiHidden/>
+    <w:unhideWhenUsed/>
+    <w:rsid w:val="00C73146"/>
+    <w:rPr>
+      <w:color w:val="605E5C"/>
+      <w:shd w:val="clear" w:color="auto" w:fill="E1DFDD"/>
+    </w:rPr>
+  </w:style>
 </w:styles>
 </file>
 

</xml_diff>